<commit_message>
Add deployment architecture diagram and section
deployment.html + deployment.png: RTL trust-zone topology (edge → secure
gateway/identity → multi-tenant platform cloud → integration → systems of
record) with cross-cutting security/governance and CI/CD environments.
Embedded as section 5.8 in the implementation plan (MD + DOCX).

Co-Authored-By: Claude Opus 4.8 <noreply@anthropic.com>
Claude-Session: https://claude.ai/code/session_01CFs1x9FtE1n2m4G8ZYWDcW
</commit_message>
<xml_diff>
--- a/docs/Implementation_Plan.docx
+++ b/docs/Implementation_Plan.docx
@@ -4925,6 +4925,199 @@
           <w:rtl w:val="1"/>
         </w:rPr>
         <w:t>מדיניות תוכן ובטיחות, כללי הסלמה, ומנגנון הערכה שוטף (eval/red-teaming) לפני כל שחרור.</w:t>
+      </w:r>
+    </w:p>
+    <w:p>
+      <w:pPr>
+        <w:pStyle w:val="Heading2"/>
+        <w:bidi/>
+        <w:jc w:val="right"/>
+      </w:pPr>
+      <w:r>
+        <w:rPr>
+          <w:rFonts w:cs="David" w:ascii="David" w:hAnsi="David"/>
+          <w:rtl w:val="1"/>
+        </w:rPr>
+        <w:t>5.8 ארכיטקטורת פריסה (Deployment / Topology)</w:t>
+      </w:r>
+    </w:p>
+    <w:p>
+      <w:pPr>
+        <w:jc w:val="center"/>
+      </w:pPr>
+      <w:r>
+        <w:drawing>
+          <wp:inline xmlns:a="http://schemas.openxmlformats.org/drawingml/2006/main" xmlns:pic="http://schemas.openxmlformats.org/drawingml/2006/picture">
+            <wp:extent cx="5400000" cy="3688732"/>
+            <wp:docPr id="2" name="Picture 2"/>
+            <wp:cNvGraphicFramePr>
+              <a:graphicFrameLocks noChangeAspect="1"/>
+            </wp:cNvGraphicFramePr>
+            <a:graphic>
+              <a:graphicData uri="http://schemas.openxmlformats.org/drawingml/2006/picture">
+                <pic:pic>
+                  <pic:nvPicPr>
+                    <pic:cNvPr id="0" name="deployment.png"/>
+                    <pic:cNvPicPr/>
+                  </pic:nvPicPr>
+                  <pic:blipFill>
+                    <a:blip r:embed="rId10"/>
+                    <a:stretch>
+                      <a:fillRect/>
+                    </a:stretch>
+                  </pic:blipFill>
+                  <pic:spPr>
+                    <a:xfrm>
+                      <a:off x="0" y="0"/>
+                      <a:ext cx="5400000" cy="3688732"/>
+                    </a:xfrm>
+                    <a:prstGeom prst="rect"/>
+                  </pic:spPr>
+                </pic:pic>
+              </a:graphicData>
+            </a:graphic>
+          </wp:inline>
+        </w:drawing>
+      </w:r>
+    </w:p>
+    <w:p>
+      <w:pPr>
+        <w:bidi/>
+        <w:jc w:val="center"/>
+      </w:pPr>
+      <w:r>
+        <w:rPr>
+          <w:rFonts w:cs="David" w:ascii="David" w:hAnsi="David"/>
+          <w:i/>
+          <w:sz w:val="18"/>
+          <w:rtl w:val="1"/>
+        </w:rPr>
+        <w:t>פריסה: זרימת הבקשה מהתושב (ימין) דרך שער מאובטח, ליבת פלטפורמה רב-שוכרת בענן, שכבת אינטגרציה ומערכות הרשומה (שמאל); שכבת אבטחה וממשל חוצה את כל האזורים.</w:t>
+      </w:r>
+    </w:p>
+    <w:p>
+      <w:pPr>
+        <w:pStyle w:val="ListBullet"/>
+        <w:bidi/>
+        <w:jc w:val="right"/>
+      </w:pPr>
+      <w:r>
+        <w:rPr>
+          <w:rFonts w:cs="David" w:ascii="David" w:hAnsi="David"/>
+          <w:b/>
+          <w:rtl w:val="1"/>
+        </w:rPr>
+        <w:t>אזורי אמון (Trust Zones):</w:t>
+      </w:r>
+      <w:r>
+        <w:rPr>
+          <w:rFonts w:cs="David" w:ascii="David" w:hAnsi="David"/>
+          <w:rtl w:val="1"/>
+        </w:rPr>
+        <w:t xml:space="preserve"> קצה ותושבים → שער מאובטח (API Gateway/WAF, CTI/SBC לקול, WhatsApp Business API) והזדהות (SSO + MFA + מערך הדיגיטל הלאומי) → ליבת הפלטפורמה בענן → שכבת אינטגרציה (iPaaS) → מערכות רשומה ומקורות. כל אינטראקציה עוברת דרך השער; פעולות רגישות מחייבות אימות זהות.</w:t>
+      </w:r>
+    </w:p>
+    <w:p>
+      <w:pPr>
+        <w:pStyle w:val="ListBullet"/>
+        <w:bidi/>
+        <w:jc w:val="right"/>
+      </w:pPr>
+      <w:r>
+        <w:rPr>
+          <w:rFonts w:cs="David" w:ascii="David" w:hAnsi="David"/>
+          <w:b/>
+          <w:rtl w:val="1"/>
+        </w:rPr>
+        <w:t>ליבה רב-שוכרת (Multi-tenant):</w:t>
+      </w:r>
+      <w:r>
+        <w:rPr>
+          <w:rFonts w:cs="David" w:ascii="David" w:hAnsi="David"/>
+          <w:rtl w:val="1"/>
+        </w:rPr>
+        <w:t xml:space="preserve"> Salesforce PSS/AgentForce כ-SaaS, עם שכבת AI (NLU/RAG/Dialog/Guardrails), Case/BPM, Data Cloud (תיק 360°) ואנליטיקה — עם </w:t>
+      </w:r>
+      <w:r>
+        <w:rPr>
+          <w:rFonts w:cs="David" w:ascii="David" w:hAnsi="David"/>
+          <w:b/>
+          <w:rtl w:val="1"/>
+        </w:rPr>
+        <w:t>בידוד נתונים מלא לכל רשות</w:t>
+      </w:r>
+      <w:r>
+        <w:rPr>
+          <w:rFonts w:cs="David" w:ascii="David" w:hAnsi="David"/>
+          <w:rtl w:val="1"/>
+        </w:rPr>
+        <w:t xml:space="preserve"> (חולון, חיפה, גני תקווה, ורשויות נוספות).</w:t>
+      </w:r>
+    </w:p>
+    <w:p>
+      <w:pPr>
+        <w:pStyle w:val="ListBullet"/>
+        <w:bidi/>
+        <w:jc w:val="right"/>
+      </w:pPr>
+      <w:r>
+        <w:rPr>
+          <w:rFonts w:cs="David" w:ascii="David" w:hAnsi="David"/>
+          <w:b/>
+          <w:rtl w:val="1"/>
+        </w:rPr>
+        <w:t>מקורות ושירותים חיצוניים:</w:t>
+      </w:r>
+      <w:r>
+        <w:rPr>
+          <w:rFonts w:cs="David" w:ascii="David" w:hAnsi="David"/>
+          <w:rtl w:val="1"/>
+        </w:rPr>
+        <w:t xml:space="preserve"> מערכת גבייה/ERP, GIS/הנדסה, חינוך/רווחה, DMS, ספק סליקה PCI-DSS, ומערך הדיגיטל כמקור זהות — כולם דרך ה-iPaaS עם OAuth ו-Audit.</w:t>
+      </w:r>
+    </w:p>
+    <w:p>
+      <w:pPr>
+        <w:pStyle w:val="ListBullet"/>
+        <w:bidi/>
+        <w:jc w:val="right"/>
+      </w:pPr>
+      <w:r>
+        <w:rPr>
+          <w:rFonts w:cs="David" w:ascii="David" w:hAnsi="David"/>
+          <w:b/>
+          <w:rtl w:val="1"/>
+        </w:rPr>
+        <w:t>אבטחה חוצת-אזורים:</w:t>
+      </w:r>
+      <w:r>
+        <w:rPr>
+          <w:rFonts w:cs="David" w:ascii="David" w:hAnsi="David"/>
+          <w:rtl w:val="1"/>
+        </w:rPr>
+        <w:t xml:space="preserve"> Salesforce Shield, הצפנה (Rest &amp; Transit), RBAC, MFA/SSO, Audit Trail/SIEM, DPO/תיקון 13, ותקינה ISO 27001/27701 ו-SOC 2. נתונים נשמרים בישראל בהתאם לרגולציה.</w:t>
+      </w:r>
+    </w:p>
+    <w:p>
+      <w:pPr>
+        <w:pStyle w:val="ListBullet"/>
+        <w:bidi/>
+        <w:jc w:val="right"/>
+      </w:pPr>
+      <w:r>
+        <w:rPr>
+          <w:rFonts w:cs="David" w:ascii="David" w:hAnsi="David"/>
+          <w:b/>
+          <w:rtl w:val="1"/>
+        </w:rPr>
+        <w:t>סביבות ו-CI/CD:</w:t>
+      </w:r>
+      <w:r>
+        <w:rPr>
+          <w:rFonts w:cs="David" w:ascii="David" w:hAnsi="David"/>
+          <w:rtl w:val="1"/>
+        </w:rPr>
+        <w:t xml:space="preserve"> קידום מבוקר Dev → Test → UAT → Production על גבי Salesforce Sandboxes, קונפיגורציה כקוד, בקרת גרסאות ו-Rollback.</w:t>
       </w:r>
     </w:p>
     <w:p>

</xml_diff>